<commit_message>
Updated member info and signed - Dylan
</commit_message>
<xml_diff>
--- a/00_Project_Administration/Group_Declaration_and_Roles.docx
+++ b/00_Project_Administration/Group_Declaration_and_Roles.docx
@@ -326,7 +326,13 @@
         <w:t>Name:</w:t>
       </w:r>
       <w:r>
-        <w:t xml:space="preserve"> Dylan Shepard [Insert Student Number] //todo</w:t>
+        <w:t xml:space="preserve"> Dylan Shepard [</w:t>
+      </w:r>
+      <w:r>
+        <w:t>20240887</w:t>
+      </w:r>
+      <w:r>
+        <w:t>]</w:t>
       </w:r>
     </w:p>
     <w:p>
@@ -345,7 +351,10 @@
         <w:t>Role:</w:t>
       </w:r>
       <w:r>
-        <w:t xml:space="preserve"> Group Member</w:t>
+        <w:t xml:space="preserve"> Group </w:t>
+      </w:r>
+      <w:r>
+        <w:t>Testing/QA</w:t>
       </w:r>
     </w:p>
     <w:p>
@@ -367,7 +376,7 @@
         <w:t xml:space="preserve"> </w:t>
       </w:r>
       <w:r>
-        <w:t>Contribution to the 3-tier architecture build, including the relational database, REST API, and responsive web frontend.</w:t>
+        <w:t>Review Git commits and documentation for consistency and accuracy. Test the application, identify and fix issues, and ensure features developed by all group members integrate correctly and meet quality standards.</w:t>
       </w:r>
     </w:p>
     <w:p>
@@ -512,7 +521,23 @@
     </w:p>
     <w:p>
       <w:r>
-        <w:t xml:space="preserve">Dylan Shepard: </w:t>
+        <w:t>Dylan Shepard:</w:t>
+      </w:r>
+      <w:r>
+        <w:t xml:space="preserve"> DS</w:t>
+      </w:r>
+      <w:r>
+        <w:tab/>
+      </w:r>
+      <w:r>
+        <w:tab/>
+        <w:t>Date: 9 October 2026</w:t>
+      </w:r>
+      <w:r>
+        <w:tab/>
+      </w:r>
+      <w:r>
+        <w:tab/>
       </w:r>
     </w:p>
     <w:p>

</xml_diff>